<commit_message>
chore: update student hall ticket number to 2403A51422 and email identity
</commit_message>
<xml_diff>
--- a/SESD_Assignment_3_CSE_Website_Report.docx
+++ b/SESD_Assignment_3_CSE_Website_Report.docx
@@ -526,7 +526,7 @@
           <w:spacing w:val="0"/>
           <w:color w:val="171E2D"/>
         </w:rPr>
-        <w:t xml:space="preserve">2403A51421</w:t>
+        <w:t xml:space="preserve">2403A51422</w:t>
       </w:r>
       <w:r>
         <w:rPr>
@@ -1580,7 +1580,7 @@
           <w:spacing w:val="0"/>
           <w:color w:val="41DB6D"/>
         </w:rPr>
-        <w:t xml:space="preserve">$ git config user.email "2403a51421@sru.edu.in"</w:t>
+        <w:t xml:space="preserve">$ git config user.email "2403a51422@sru.edu.in"</w:t>
       </w:r>
       <w:r>
         <w:rPr>

</xml_diff>